<commit_message>
feat: simplify CV download button and update template for better data handling
</commit_message>
<xml_diff>
--- a/public/template.docx
+++ b/public/template.docx
@@ -51,6 +51,7 @@
           <w:tcPr>
             <w:tcW w:w="4997" w:type="dxa"/>
             <w:tcBorders>
+              <w:bottom w:val="single" w:color="auto" w:sz="4" w:space="0"/>
               <w:tl2br w:val="nil"/>
               <w:tr2bl w:val="nil"/>
             </w:tcBorders>
@@ -116,6 +117,7 @@
           <w:tcPr>
             <w:tcW w:w="4975" w:type="dxa"/>
             <w:tcBorders>
+              <w:bottom w:val="single" w:color="auto" w:sz="4" w:space="0"/>
               <w:tl2br w:val="nil"/>
               <w:tr2bl w:val="nil"/>
             </w:tcBorders>
@@ -202,9 +204,15 @@
     <w:p>
       <w:pPr>
         <w:pStyle w:val="2"/>
+        <w:pBdr>
+          <w:bottom w:val="single" w:color="auto" w:sz="4" w:space="0"/>
+        </w:pBdr>
         <w:bidi w:val="0"/>
         <w:rPr>
-          <w:rFonts w:hint="default"/>
+          <w:rFonts w:hint="default" w:ascii="Roboto" w:hAnsi="Roboto" w:cs="Roboto"/>
+          <w:b/>
+          <w:bCs/>
+          <w:color w:val="auto"/>
           <w:lang w:val="en-US"/>
         </w:rPr>
       </w:pPr>
@@ -239,27 +247,21 @@
           <w:szCs w:val="28"/>
           <w:lang w:val="en-US"/>
         </w:rPr>
-        <w:t>{abo</w:t>
-      </w:r>
-      <w:bookmarkStart w:id="0" w:name="_GoBack"/>
-      <w:bookmarkEnd w:id="0"/>
-      <w:r>
-        <w:rPr>
-          <w:rFonts w:hint="default" w:ascii="Roboto" w:hAnsi="Roboto" w:cs="Roboto"/>
-          <w:color w:val="auto"/>
-          <w:sz w:val="22"/>
-          <w:szCs w:val="28"/>
-          <w:lang w:val="en-US"/>
-        </w:rPr>
-        <w:t>ut}</w:t>
+        <w:t>{about}</w:t>
       </w:r>
     </w:p>
     <w:p>
       <w:pPr>
         <w:pStyle w:val="2"/>
+        <w:pBdr>
+          <w:bottom w:val="single" w:color="auto" w:sz="4" w:space="0"/>
+        </w:pBdr>
         <w:bidi w:val="0"/>
         <w:rPr>
-          <w:rFonts w:hint="default"/>
+          <w:rFonts w:hint="default" w:ascii="Roboto" w:hAnsi="Roboto" w:cs="Roboto"/>
+          <w:b/>
+          <w:bCs/>
+          <w:color w:val="auto"/>
           <w:lang w:val="en-US"/>
         </w:rPr>
       </w:pPr>
@@ -483,9 +485,15 @@
     <w:p>
       <w:pPr>
         <w:pStyle w:val="2"/>
+        <w:pBdr>
+          <w:bottom w:val="single" w:color="auto" w:sz="4" w:space="0"/>
+        </w:pBdr>
         <w:bidi w:val="0"/>
         <w:rPr>
-          <w:rFonts w:hint="default"/>
+          <w:rFonts w:hint="default" w:ascii="Roboto" w:hAnsi="Roboto" w:cs="Roboto"/>
+          <w:b/>
+          <w:bCs/>
+          <w:color w:val="auto"/>
           <w:lang w:val="en-US"/>
         </w:rPr>
       </w:pPr>
@@ -542,7 +550,7 @@
     <w:tbl>
       <w:tblPr>
         <w:tblStyle w:val="15"/>
-        <w:tblW w:w="0" w:type="auto"/>
+        <w:tblW w:w="4999" w:type="pct"/>
         <w:tblInd w:w="0" w:type="dxa"/>
         <w:tblBorders>
           <w:top w:val="none" w:color="auto" w:sz="0" w:space="0"/>
@@ -554,13 +562,15 @@
         </w:tblBorders>
         <w:tblLayout w:type="autofit"/>
         <w:tblCellMar>
+          <w:top w:w="0" w:type="dxa"/>
           <w:left w:w="108" w:type="dxa"/>
+          <w:bottom w:w="0" w:type="dxa"/>
           <w:right w:w="108" w:type="dxa"/>
         </w:tblCellMar>
       </w:tblPr>
       <w:tblGrid>
-        <w:gridCol w:w="6953"/>
-        <w:gridCol w:w="2900"/>
+        <w:gridCol w:w="5710"/>
+        <w:gridCol w:w="4141"/>
       </w:tblGrid>
       <w:tr>
         <w:tblPrEx>
@@ -573,16 +583,72 @@
             <w:insideV w:val="none" w:color="auto" w:sz="0" w:space="0"/>
           </w:tblBorders>
           <w:tblCellMar>
+            <w:top w:w="0" w:type="dxa"/>
             <w:left w:w="108" w:type="dxa"/>
+            <w:bottom w:w="0" w:type="dxa"/>
             <w:right w:w="108" w:type="dxa"/>
           </w:tblCellMar>
         </w:tblPrEx>
         <w:trPr>
-          <w:trHeight w:val="736" w:hRule="atLeast"/>
+          <w:trHeight w:val="352" w:hRule="atLeast"/>
         </w:trPr>
         <w:tc>
           <w:tcPr>
-            <w:tcW w:w="6953" w:type="dxa"/>
+            <w:tcW w:w="2898" w:type="pct"/>
+            <w:vAlign w:val="top"/>
+          </w:tcPr>
+          <w:p>
+            <w:pPr>
+              <w:keepNext w:val="0"/>
+              <w:keepLines w:val="0"/>
+              <w:pageBreakBefore w:val="0"/>
+              <w:widowControl/>
+              <w:numPr>
+                <w:ilvl w:val="0"/>
+                <w:numId w:val="3"/>
+              </w:numPr>
+              <w:tabs>
+                <w:tab w:val="clear" w:pos="420"/>
+              </w:tabs>
+              <w:kinsoku/>
+              <w:wordWrap/>
+              <w:overflowPunct/>
+              <w:topLinePunct w:val="0"/>
+              <w:autoSpaceDE/>
+              <w:autoSpaceDN/>
+              <w:bidi w:val="0"/>
+              <w:adjustRightInd/>
+              <w:snapToGrid/>
+              <w:spacing w:line="300" w:lineRule="auto"/>
+              <w:ind w:left="420" w:leftChars="0" w:hanging="420" w:firstLineChars="0"/>
+              <w:jc w:val="both"/>
+              <w:textAlignment w:val="auto"/>
+              <w:rPr>
+                <w:rFonts w:hint="default" w:ascii="Roboto" w:hAnsi="Roboto" w:cs="Roboto"/>
+                <w:color w:val="auto"/>
+                <w:sz w:val="22"/>
+                <w:szCs w:val="28"/>
+                <w:vertAlign w:val="baseline"/>
+                <w:lang w:val="en-US"/>
+              </w:rPr>
+            </w:pPr>
+            <w:r>
+              <w:rPr>
+                <w:rFonts w:hint="default" w:ascii="Roboto" w:hAnsi="Roboto" w:cs="Roboto"/>
+                <w:b/>
+                <w:bCs/>
+                <w:color w:val="auto"/>
+                <w:sz w:val="24"/>
+                <w:szCs w:val="32"/>
+              </w:rPr>
+              <w:t>{posisi}</w:t>
+            </w:r>
+          </w:p>
+        </w:tc>
+        <w:tc>
+          <w:tcPr>
+            <w:tcW w:w="2101" w:type="pct"/>
+            <w:vAlign w:val="top"/>
           </w:tcPr>
           <w:p>
             <w:pPr>
@@ -604,93 +670,6 @@
               <w:adjustRightInd/>
               <w:snapToGrid/>
               <w:spacing w:line="300" w:lineRule="auto"/>
-              <w:jc w:val="both"/>
-              <w:textAlignment w:val="auto"/>
-              <w:rPr>
-                <w:rFonts w:hint="default" w:ascii="Roboto" w:hAnsi="Roboto" w:cs="Roboto"/>
-                <w:color w:val="auto"/>
-                <w:sz w:val="22"/>
-                <w:szCs w:val="28"/>
-              </w:rPr>
-            </w:pPr>
-            <w:r>
-              <w:rPr>
-                <w:rFonts w:hint="default" w:ascii="Roboto" w:hAnsi="Roboto" w:cs="Roboto"/>
-                <w:b/>
-                <w:bCs/>
-                <w:color w:val="auto"/>
-                <w:sz w:val="22"/>
-                <w:szCs w:val="28"/>
-              </w:rPr>
-              <w:t>{posisi}</w:t>
-            </w:r>
-          </w:p>
-          <w:p>
-            <w:pPr>
-              <w:keepNext w:val="0"/>
-              <w:keepLines w:val="0"/>
-              <w:pageBreakBefore w:val="0"/>
-              <w:widowControl/>
-              <w:numPr>
-                <w:ilvl w:val="0"/>
-                <w:numId w:val="0"/>
-              </w:numPr>
-              <w:kinsoku/>
-              <w:wordWrap/>
-              <w:overflowPunct/>
-              <w:topLinePunct w:val="0"/>
-              <w:autoSpaceDE/>
-              <w:autoSpaceDN/>
-              <w:bidi w:val="0"/>
-              <w:adjustRightInd/>
-              <w:snapToGrid/>
-              <w:spacing w:line="300" w:lineRule="auto"/>
-              <w:jc w:val="both"/>
-              <w:textAlignment w:val="auto"/>
-              <w:rPr>
-                <w:rFonts w:hint="default" w:ascii="Roboto" w:hAnsi="Roboto" w:cs="Roboto"/>
-                <w:color w:val="auto"/>
-                <w:sz w:val="22"/>
-                <w:szCs w:val="28"/>
-                <w:vertAlign w:val="baseline"/>
-                <w:lang w:val="en-US"/>
-              </w:rPr>
-            </w:pPr>
-            <w:r>
-              <w:rPr>
-                <w:rFonts w:hint="default" w:ascii="Roboto" w:hAnsi="Roboto" w:cs="Roboto"/>
-                <w:color w:val="auto"/>
-                <w:sz w:val="22"/>
-                <w:szCs w:val="28"/>
-              </w:rPr>
-              <w:t>{perusahaan}</w:t>
-            </w:r>
-          </w:p>
-        </w:tc>
-        <w:tc>
-          <w:tcPr>
-            <w:tcW w:w="2900" w:type="dxa"/>
-          </w:tcPr>
-          <w:p>
-            <w:pPr>
-              <w:keepNext w:val="0"/>
-              <w:keepLines w:val="0"/>
-              <w:pageBreakBefore w:val="0"/>
-              <w:widowControl/>
-              <w:numPr>
-                <w:ilvl w:val="0"/>
-                <w:numId w:val="0"/>
-              </w:numPr>
-              <w:kinsoku/>
-              <w:wordWrap/>
-              <w:overflowPunct/>
-              <w:topLinePunct w:val="0"/>
-              <w:autoSpaceDE/>
-              <w:autoSpaceDN/>
-              <w:bidi w:val="0"/>
-              <w:adjustRightInd/>
-              <w:snapToGrid/>
-              <w:spacing w:after="361" w:afterLines="100" w:line="300" w:lineRule="auto"/>
               <w:jc w:val="right"/>
               <w:textAlignment w:val="auto"/>
               <w:rPr>
@@ -727,14 +706,97 @@
             <w:insideV w:val="none" w:color="auto" w:sz="0" w:space="0"/>
           </w:tblBorders>
           <w:tblCellMar>
+            <w:top w:w="0" w:type="dxa"/>
             <w:left w:w="108" w:type="dxa"/>
+            <w:bottom w:w="0" w:type="dxa"/>
             <w:right w:w="108" w:type="dxa"/>
           </w:tblCellMar>
         </w:tblPrEx>
+        <w:trPr>
+          <w:trHeight w:val="0" w:hRule="atLeast"/>
+        </w:trPr>
         <w:tc>
           <w:tcPr>
-            <w:tcW w:w="9853" w:type="dxa"/>
+            <w:tcW w:w="5000" w:type="pct"/>
             <w:gridSpan w:val="2"/>
+            <w:vAlign w:val="top"/>
+          </w:tcPr>
+          <w:p>
+            <w:pPr>
+              <w:keepNext w:val="0"/>
+              <w:keepLines w:val="0"/>
+              <w:pageBreakBefore w:val="0"/>
+              <w:widowControl/>
+              <w:numPr>
+                <w:ilvl w:val="0"/>
+                <w:numId w:val="0"/>
+              </w:numPr>
+              <w:kinsoku/>
+              <w:wordWrap/>
+              <w:overflowPunct/>
+              <w:topLinePunct w:val="0"/>
+              <w:autoSpaceDE/>
+              <w:autoSpaceDN/>
+              <w:bidi w:val="0"/>
+              <w:adjustRightInd/>
+              <w:snapToGrid w:val="0"/>
+              <w:spacing w:after="120" w:afterAutospacing="0" w:line="360" w:lineRule="auto"/>
+              <w:ind w:left="400" w:leftChars="200" w:firstLine="0" w:firstLineChars="0"/>
+              <w:jc w:val="both"/>
+              <w:textAlignment w:val="auto"/>
+              <w:rPr>
+                <w:rFonts w:hint="default" w:ascii="Roboto" w:hAnsi="Roboto" w:cs="Roboto"/>
+                <w:color w:val="auto"/>
+                <w:sz w:val="22"/>
+                <w:szCs w:val="28"/>
+                <w:lang w:val="en-US"/>
+              </w:rPr>
+            </w:pPr>
+            <w:r>
+              <w:rPr>
+                <w:rFonts w:hint="default" w:ascii="Roboto" w:hAnsi="Roboto" w:cs="Roboto"/>
+                <w:color w:val="404040" w:themeColor="text1" w:themeTint="BF"/>
+                <w:sz w:val="22"/>
+                <w:szCs w:val="28"/>
+                <w14:textFill>
+                  <w14:solidFill>
+                    <w14:schemeClr w14:val="tx1">
+                      <w14:lumMod w14:val="75000"/>
+                      <w14:lumOff w14:val="25000"/>
+                    </w14:schemeClr>
+                  </w14:solidFill>
+                </w14:textFill>
+              </w:rPr>
+              <w:t>{perusahaan}</w:t>
+            </w:r>
+          </w:p>
+        </w:tc>
+      </w:tr>
+      <w:tr>
+        <w:tblPrEx>
+          <w:tblBorders>
+            <w:top w:val="none" w:color="auto" w:sz="0" w:space="0"/>
+            <w:left w:val="none" w:color="auto" w:sz="0" w:space="0"/>
+            <w:bottom w:val="none" w:color="auto" w:sz="0" w:space="0"/>
+            <w:right w:val="none" w:color="auto" w:sz="0" w:space="0"/>
+            <w:insideH w:val="none" w:color="auto" w:sz="0" w:space="0"/>
+            <w:insideV w:val="none" w:color="auto" w:sz="0" w:space="0"/>
+          </w:tblBorders>
+          <w:tblCellMar>
+            <w:top w:w="0" w:type="dxa"/>
+            <w:left w:w="108" w:type="dxa"/>
+            <w:bottom w:w="0" w:type="dxa"/>
+            <w:right w:w="108" w:type="dxa"/>
+          </w:tblCellMar>
+        </w:tblPrEx>
+        <w:trPr>
+          <w:trHeight w:val="0" w:hRule="atLeast"/>
+        </w:trPr>
+        <w:tc>
+          <w:tcPr>
+            <w:tcW w:w="5000" w:type="pct"/>
+            <w:gridSpan w:val="2"/>
+            <w:vAlign w:val="top"/>
           </w:tcPr>
           <w:p>
             <w:pPr>
@@ -755,7 +817,8 @@
               <w:bidi w:val="0"/>
               <w:adjustRightInd/>
               <w:snapToGrid/>
-              <w:spacing w:after="100" w:afterAutospacing="1" w:line="360" w:lineRule="auto"/>
+              <w:spacing w:afterAutospacing="0" w:line="360" w:lineRule="auto"/>
+              <w:ind w:left="400" w:leftChars="200" w:firstLine="0" w:firstLineChars="0"/>
               <w:jc w:val="both"/>
               <w:textAlignment w:val="auto"/>
               <w:rPr>
@@ -763,7 +826,6 @@
                 <w:color w:val="auto"/>
                 <w:sz w:val="22"/>
                 <w:szCs w:val="28"/>
-                <w:vertAlign w:val="baseline"/>
                 <w:lang w:val="en-US"/>
               </w:rPr>
             </w:pPr>
@@ -776,7 +838,7 @@
                 <w:vertAlign w:val="baseline"/>
                 <w:lang w:val="en-US"/>
               </w:rPr>
-              <w:t>{</w:t>
+              <w:t>{#</w:t>
             </w:r>
             <w:r>
               <w:rPr>
@@ -796,6 +858,219 @@
                 <w:lang w:val="en-US"/>
               </w:rPr>
               <w:t>}</w:t>
+            </w:r>
+          </w:p>
+          <w:p>
+            <w:pPr>
+              <w:keepNext w:val="0"/>
+              <w:keepLines w:val="0"/>
+              <w:pageBreakBefore w:val="0"/>
+              <w:widowControl/>
+              <w:numPr>
+                <w:ilvl w:val="0"/>
+                <w:numId w:val="0"/>
+              </w:numPr>
+              <w:kinsoku/>
+              <w:wordWrap/>
+              <w:overflowPunct/>
+              <w:topLinePunct w:val="0"/>
+              <w:autoSpaceDE/>
+              <w:autoSpaceDN/>
+              <w:bidi w:val="0"/>
+              <w:adjustRightInd/>
+              <w:snapToGrid/>
+              <w:spacing w:afterAutospacing="0" w:line="360" w:lineRule="auto"/>
+              <w:ind w:left="400" w:leftChars="200" w:firstLine="0" w:firstLineChars="0"/>
+              <w:jc w:val="both"/>
+              <w:textAlignment w:val="auto"/>
+              <w:rPr>
+                <w:rFonts w:hint="default" w:ascii="Roboto" w:hAnsi="Roboto" w:cs="Roboto"/>
+                <w:color w:val="auto"/>
+                <w:sz w:val="22"/>
+                <w:szCs w:val="28"/>
+                <w:lang w:val="en-US"/>
+              </w:rPr>
+            </w:pPr>
+            <w:r>
+              <w:rPr>
+                <w:rFonts w:hint="default" w:ascii="Roboto" w:hAnsi="Roboto" w:cs="Roboto"/>
+                <w:color w:val="auto"/>
+                <w:sz w:val="22"/>
+                <w:szCs w:val="28"/>
+                <w:lang w:val="en-US"/>
+              </w:rPr>
+              <w:t>{deskripsi}</w:t>
+            </w:r>
+          </w:p>
+          <w:p>
+            <w:pPr>
+              <w:keepNext w:val="0"/>
+              <w:keepLines w:val="0"/>
+              <w:pageBreakBefore w:val="0"/>
+              <w:widowControl/>
+              <w:numPr>
+                <w:ilvl w:val="0"/>
+                <w:numId w:val="0"/>
+              </w:numPr>
+              <w:kinsoku/>
+              <w:wordWrap/>
+              <w:overflowPunct/>
+              <w:topLinePunct w:val="0"/>
+              <w:autoSpaceDE/>
+              <w:autoSpaceDN/>
+              <w:bidi w:val="0"/>
+              <w:adjustRightInd/>
+              <w:snapToGrid/>
+              <w:spacing w:after="240" w:afterAutospacing="0" w:line="360" w:lineRule="auto"/>
+              <w:ind w:left="400" w:leftChars="200" w:firstLine="0" w:firstLineChars="0"/>
+              <w:jc w:val="both"/>
+              <w:textAlignment w:val="auto"/>
+              <w:rPr>
+                <w:rFonts w:hint="default" w:ascii="Roboto" w:hAnsi="Roboto" w:cs="Roboto"/>
+                <w:color w:val="auto"/>
+                <w:sz w:val="22"/>
+                <w:szCs w:val="28"/>
+                <w:lang w:val="en-US"/>
+              </w:rPr>
+            </w:pPr>
+            <w:r>
+              <w:rPr>
+                <w:rFonts w:hint="default" w:ascii="Roboto" w:hAnsi="Roboto" w:cs="Roboto"/>
+                <w:color w:val="auto"/>
+                <w:sz w:val="22"/>
+                <w:szCs w:val="28"/>
+                <w:lang w:val="en-US"/>
+              </w:rPr>
+              <w:t>{/deskripsi}</w:t>
+            </w:r>
+          </w:p>
+          <w:p>
+            <w:pPr>
+              <w:keepNext w:val="0"/>
+              <w:keepLines w:val="0"/>
+              <w:pageBreakBefore w:val="0"/>
+              <w:widowControl/>
+              <w:numPr>
+                <w:ilvl w:val="0"/>
+                <w:numId w:val="0"/>
+              </w:numPr>
+              <w:kinsoku/>
+              <w:wordWrap/>
+              <w:overflowPunct/>
+              <w:topLinePunct w:val="0"/>
+              <w:autoSpaceDE/>
+              <w:autoSpaceDN/>
+              <w:bidi w:val="0"/>
+              <w:adjustRightInd/>
+              <w:snapToGrid/>
+              <w:spacing w:before="120" w:afterAutospacing="0" w:line="360" w:lineRule="auto"/>
+              <w:ind w:left="400" w:leftChars="200" w:firstLine="0" w:firstLineChars="0"/>
+              <w:jc w:val="both"/>
+              <w:textAlignment w:val="auto"/>
+              <w:rPr>
+                <w:rFonts w:hint="default" w:ascii="Roboto" w:hAnsi="Roboto" w:cs="Roboto"/>
+                <w:color w:val="auto"/>
+                <w:sz w:val="22"/>
+                <w:szCs w:val="28"/>
+                <w:lang w:val="en-US"/>
+              </w:rPr>
+            </w:pPr>
+            <w:r>
+              <w:rPr>
+                <w:rFonts w:hint="default" w:ascii="Roboto" w:hAnsi="Roboto" w:cs="Roboto"/>
+                <w:color w:val="auto"/>
+                <w:sz w:val="22"/>
+                <w:szCs w:val="28"/>
+                <w:lang w:val="en-US"/>
+              </w:rPr>
+              <w:t>{#tanggungjawab}</w:t>
+            </w:r>
+          </w:p>
+          <w:p>
+            <w:pPr>
+              <w:keepNext w:val="0"/>
+              <w:keepLines w:val="0"/>
+              <w:pageBreakBefore w:val="0"/>
+              <w:widowControl/>
+              <w:numPr>
+                <w:ilvl w:val="0"/>
+                <w:numId w:val="4"/>
+              </w:numPr>
+              <w:tabs>
+                <w:tab w:val="clear" w:pos="420"/>
+              </w:tabs>
+              <w:kinsoku/>
+              <w:wordWrap/>
+              <w:overflowPunct/>
+              <w:topLinePunct w:val="0"/>
+              <w:autoSpaceDE/>
+              <w:autoSpaceDN/>
+              <w:bidi w:val="0"/>
+              <w:adjustRightInd/>
+              <w:snapToGrid/>
+              <w:spacing w:afterAutospacing="0" w:line="360" w:lineRule="auto"/>
+              <w:ind w:left="798" w:leftChars="200" w:hanging="398" w:hangingChars="181"/>
+              <w:jc w:val="both"/>
+              <w:textAlignment w:val="auto"/>
+              <w:rPr>
+                <w:rFonts w:hint="default" w:ascii="Roboto" w:hAnsi="Roboto" w:cs="Roboto"/>
+                <w:color w:val="auto"/>
+                <w:sz w:val="22"/>
+                <w:szCs w:val="28"/>
+                <w:lang w:val="en-US"/>
+              </w:rPr>
+            </w:pPr>
+            <w:r>
+              <w:rPr>
+                <w:rFonts w:hint="default" w:ascii="Roboto" w:hAnsi="Roboto" w:cs="Roboto"/>
+                <w:color w:val="auto"/>
+                <w:sz w:val="22"/>
+                <w:szCs w:val="28"/>
+                <w:lang w:val="en-US"/>
+              </w:rPr>
+              <w:t>{.}</w:t>
+            </w:r>
+          </w:p>
+          <w:p>
+            <w:pPr>
+              <w:keepNext w:val="0"/>
+              <w:keepLines w:val="0"/>
+              <w:pageBreakBefore w:val="0"/>
+              <w:widowControl/>
+              <w:numPr>
+                <w:ilvl w:val="0"/>
+                <w:numId w:val="0"/>
+              </w:numPr>
+              <w:kinsoku/>
+              <w:wordWrap/>
+              <w:overflowPunct/>
+              <w:topLinePunct w:val="0"/>
+              <w:autoSpaceDE/>
+              <w:autoSpaceDN/>
+              <w:bidi w:val="0"/>
+              <w:adjustRightInd/>
+              <w:snapToGrid w:val="0"/>
+              <w:spacing w:after="120" w:afterAutospacing="0" w:line="360" w:lineRule="auto"/>
+              <w:ind w:left="400" w:leftChars="200" w:firstLine="0" w:firstLineChars="0"/>
+              <w:jc w:val="both"/>
+              <w:textAlignment w:val="auto"/>
+              <w:rPr>
+                <w:rFonts w:hint="default" w:ascii="Roboto" w:hAnsi="Roboto" w:cs="Roboto"/>
+                <w:color w:val="auto"/>
+                <w:sz w:val="22"/>
+                <w:szCs w:val="28"/>
+                <w:lang w:val="en-US"/>
+              </w:rPr>
+            </w:pPr>
+            <w:r>
+              <w:rPr>
+                <w:rFonts w:hint="default" w:ascii="Roboto" w:hAnsi="Roboto" w:cs="Roboto"/>
+                <w:color w:val="auto"/>
+                <w:sz w:val="22"/>
+                <w:szCs w:val="28"/>
+                <w:lang w:val="en-US"/>
+              </w:rPr>
+              <w:t>{/tanggungjawab}</w:t>
             </w:r>
           </w:p>
         </w:tc>
@@ -823,6 +1098,9 @@
     <w:p>
       <w:pPr>
         <w:pStyle w:val="2"/>
+        <w:pBdr>
+          <w:bottom w:val="single" w:color="auto" w:sz="4" w:space="0"/>
+        </w:pBdr>
         <w:bidi w:val="0"/>
         <w:rPr>
           <w:rFonts w:hint="default" w:ascii="Roboto" w:hAnsi="Roboto" w:cs="Roboto"/>
@@ -868,14 +1146,20 @@
           <w:rFonts w:hint="default"/>
         </w:rPr>
       </w:pPr>
+      <w:bookmarkStart w:id="0" w:name="_GoBack"/>
       <w:r>
         <w:rPr>
           <w:rFonts w:hint="default" w:ascii="Roboto" w:hAnsi="Roboto" w:cs="Roboto"/>
+          <w:b/>
+          <w:bCs/>
           <w:color w:val="auto"/>
+          <w:sz w:val="22"/>
+          <w:szCs w:val="28"/>
           <w:lang w:val="en-US"/>
         </w:rPr>
         <w:t>Bachelor of Information Systems - Darwan Ali University</w:t>
       </w:r>
+      <w:bookmarkEnd w:id="0"/>
     </w:p>
     <w:p>
       <w:pPr>
@@ -905,6 +1189,28 @@
 <file path=word/numbering.xml><?xml version="1.0" encoding="utf-8"?>
 <w:numbering xmlns:wpc="http://schemas.microsoft.com/office/word/2010/wordprocessingCanvas" xmlns:mc="http://schemas.openxmlformats.org/markup-compatibility/2006" xmlns:o="urn:schemas-microsoft-com:office:office" xmlns:r="http://schemas.openxmlformats.org/officeDocument/2006/relationships" xmlns:m="http://schemas.openxmlformats.org/officeDocument/2006/math" xmlns:v="urn:schemas-microsoft-com:vml" xmlns:wp14="http://schemas.microsoft.com/office/word/2010/wordprocessingDrawing" xmlns:wp="http://schemas.openxmlformats.org/drawingml/2006/wordprocessingDrawing" xmlns:w10="urn:schemas-microsoft-com:office:word" xmlns:w="http://schemas.openxmlformats.org/wordprocessingml/2006/main" xmlns:w14="http://schemas.microsoft.com/office/word/2010/wordml" xmlns:wpg="http://schemas.microsoft.com/office/word/2010/wordprocessingGroup" xmlns:wpi="http://schemas.microsoft.com/office/word/2010/wordprocessingInk" xmlns:wne="http://schemas.microsoft.com/office/word/2006/wordml" xmlns:wps="http://schemas.microsoft.com/office/word/2010/wordprocessingShape" xmlns:wpsCustomData="http://www.wps.cn/officeDocument/2013/wpsCustomData" mc:Ignorable="w14 wp14">
   <w:abstractNum w:abstractNumId="0">
+    <w:nsid w:val="AFD4BB79"/>
+    <w:multiLevelType w:val="singleLevel"/>
+    <w:tmpl w:val="AFD4BB79"/>
+    <w:lvl w:ilvl="0" w:tentative="0">
+      <w:start w:val="1"/>
+      <w:numFmt w:val="bullet"/>
+      <w:lvlText w:val=""/>
+      <w:lvlJc w:val="left"/>
+      <w:pPr>
+        <w:tabs>
+          <w:tab w:val="left" w:pos="420"/>
+        </w:tabs>
+        <w:ind w:left="420" w:leftChars="0" w:hanging="420" w:firstLineChars="0"/>
+      </w:pPr>
+      <w:rPr>
+        <w:rFonts w:hint="default" w:ascii="Wingdings" w:hAnsi="Wingdings"/>
+        <w:sz w:val="16"/>
+        <w:szCs w:val="16"/>
+      </w:rPr>
+    </w:lvl>
+  </w:abstractNum>
+  <w:abstractNum w:abstractNumId="1">
     <w:nsid w:val="46167C6E"/>
     <w:multiLevelType w:val="multilevel"/>
     <w:tmpl w:val="46167C6E"/>
@@ -1024,7 +1330,29 @@
       </w:rPr>
     </w:lvl>
   </w:abstractNum>
-  <w:abstractNum w:abstractNumId="1">
+  <w:abstractNum w:abstractNumId="2">
+    <w:nsid w:val="6671D232"/>
+    <w:multiLevelType w:val="singleLevel"/>
+    <w:tmpl w:val="6671D232"/>
+    <w:lvl w:ilvl="0" w:tentative="0">
+      <w:start w:val="1"/>
+      <w:numFmt w:val="bullet"/>
+      <w:lvlText w:val=""/>
+      <w:lvlJc w:val="left"/>
+      <w:pPr>
+        <w:tabs>
+          <w:tab w:val="left" w:pos="420"/>
+        </w:tabs>
+        <w:ind w:left="420" w:leftChars="0" w:hanging="420" w:firstLineChars="0"/>
+      </w:pPr>
+      <w:rPr>
+        <w:rFonts w:hint="default" w:ascii="Wingdings" w:hAnsi="Wingdings"/>
+        <w:sz w:val="18"/>
+        <w:szCs w:val="18"/>
+      </w:rPr>
+    </w:lvl>
+  </w:abstractNum>
+  <w:abstractNum w:abstractNumId="3">
     <w:nsid w:val="7A527902"/>
     <w:multiLevelType w:val="multilevel"/>
     <w:tmpl w:val="7A527902"/>
@@ -1145,10 +1473,16 @@
     </w:lvl>
   </w:abstractNum>
   <w:num w:numId="1">
-    <w:abstractNumId w:val="0"/>
+    <w:abstractNumId w:val="1"/>
   </w:num>
   <w:num w:numId="2">
-    <w:abstractNumId w:val="1"/>
+    <w:abstractNumId w:val="3"/>
+  </w:num>
+  <w:num w:numId="3">
+    <w:abstractNumId w:val="2"/>
+  </w:num>
+  <w:num w:numId="4">
+    <w:abstractNumId w:val="0"/>
   </w:num>
 </w:numbering>
 </file>
@@ -1321,8 +1655,8 @@
     <w:lsdException w:unhideWhenUsed="0" w:uiPriority="63" w:semiHidden="0" w:name="Medium Shading 1"/>
     <w:lsdException w:unhideWhenUsed="0" w:uiPriority="64" w:semiHidden="0" w:name="Medium Shading 2"/>
     <w:lsdException w:unhideWhenUsed="0" w:uiPriority="65" w:semiHidden="0" w:name="Medium List 1"/>
-    <w:lsdException w:qFormat="1" w:unhideWhenUsed="0" w:uiPriority="66" w:semiHidden="0" w:name="Medium List 2"/>
-    <w:lsdException w:qFormat="1" w:unhideWhenUsed="0" w:uiPriority="67" w:semiHidden="0" w:name="Medium Grid 1"/>
+    <w:lsdException w:unhideWhenUsed="0" w:uiPriority="66" w:semiHidden="0" w:name="Medium List 2"/>
+    <w:lsdException w:unhideWhenUsed="0" w:uiPriority="67" w:semiHidden="0" w:name="Medium Grid 1"/>
     <w:lsdException w:unhideWhenUsed="0" w:uiPriority="68" w:semiHidden="0" w:name="Medium Grid 2"/>
     <w:lsdException w:unhideWhenUsed="0" w:uiPriority="69" w:semiHidden="0" w:name="Medium Grid 3"/>
     <w:lsdException w:unhideWhenUsed="0" w:uiPriority="70" w:semiHidden="0" w:name="Dark List"/>
@@ -1335,8 +1669,8 @@
     <w:lsdException w:unhideWhenUsed="0" w:uiPriority="63" w:semiHidden="0" w:name="Medium Shading 1 Accent 1"/>
     <w:lsdException w:unhideWhenUsed="0" w:uiPriority="64" w:semiHidden="0" w:name="Medium Shading 2 Accent 1"/>
     <w:lsdException w:unhideWhenUsed="0" w:uiPriority="65" w:semiHidden="0" w:name="Medium List 1 Accent 1"/>
-    <w:lsdException w:qFormat="1" w:unhideWhenUsed="0" w:uiPriority="66" w:semiHidden="0" w:name="Medium List 2 Accent 1"/>
-    <w:lsdException w:qFormat="1" w:unhideWhenUsed="0" w:uiPriority="67" w:semiHidden="0" w:name="Medium Grid 1 Accent 1"/>
+    <w:lsdException w:unhideWhenUsed="0" w:uiPriority="66" w:semiHidden="0" w:name="Medium List 2 Accent 1"/>
+    <w:lsdException w:unhideWhenUsed="0" w:uiPriority="67" w:semiHidden="0" w:name="Medium Grid 1 Accent 1"/>
     <w:lsdException w:unhideWhenUsed="0" w:uiPriority="68" w:semiHidden="0" w:name="Medium Grid 2 Accent 1"/>
     <w:lsdException w:unhideWhenUsed="0" w:uiPriority="69" w:semiHidden="0" w:name="Medium Grid 3 Accent 1"/>
     <w:lsdException w:unhideWhenUsed="0" w:uiPriority="70" w:semiHidden="0" w:name="Dark List Accent 1"/>
@@ -1349,7 +1683,7 @@
     <w:lsdException w:unhideWhenUsed="0" w:uiPriority="63" w:semiHidden="0" w:name="Medium Shading 1 Accent 2"/>
     <w:lsdException w:unhideWhenUsed="0" w:uiPriority="64" w:semiHidden="0" w:name="Medium Shading 2 Accent 2"/>
     <w:lsdException w:unhideWhenUsed="0" w:uiPriority="65" w:semiHidden="0" w:name="Medium List 1 Accent 2"/>
-    <w:lsdException w:qFormat="1" w:unhideWhenUsed="0" w:uiPriority="66" w:semiHidden="0" w:name="Medium List 2 Accent 2"/>
+    <w:lsdException w:unhideWhenUsed="0" w:uiPriority="66" w:semiHidden="0" w:name="Medium List 2 Accent 2"/>
     <w:lsdException w:unhideWhenUsed="0" w:uiPriority="67" w:semiHidden="0" w:name="Medium Grid 1 Accent 2"/>
     <w:lsdException w:unhideWhenUsed="0" w:uiPriority="68" w:semiHidden="0" w:name="Medium Grid 2 Accent 2"/>
     <w:lsdException w:unhideWhenUsed="0" w:uiPriority="69" w:semiHidden="0" w:name="Medium Grid 3 Accent 2"/>
@@ -1376,7 +1710,7 @@
     <w:lsdException w:unhideWhenUsed="0" w:uiPriority="62" w:semiHidden="0" w:name="Light Grid Accent 4"/>
     <w:lsdException w:unhideWhenUsed="0" w:uiPriority="63" w:semiHidden="0" w:name="Medium Shading 1 Accent 4"/>
     <w:lsdException w:unhideWhenUsed="0" w:uiPriority="64" w:semiHidden="0" w:name="Medium Shading 2 Accent 4"/>
-    <w:lsdException w:qFormat="1" w:unhideWhenUsed="0" w:uiPriority="65" w:semiHidden="0" w:name="Medium List 1 Accent 4"/>
+    <w:lsdException w:unhideWhenUsed="0" w:uiPriority="65" w:semiHidden="0" w:name="Medium List 1 Accent 4"/>
     <w:lsdException w:unhideWhenUsed="0" w:uiPriority="66" w:semiHidden="0" w:name="Medium List 2 Accent 4"/>
     <w:lsdException w:unhideWhenUsed="0" w:uiPriority="67" w:semiHidden="0" w:name="Medium Grid 1 Accent 4"/>
     <w:lsdException w:unhideWhenUsed="0" w:uiPriority="68" w:semiHidden="0" w:name="Medium Grid 2 Accent 4"/>
@@ -4671,35 +5005,10 @@
 </file>
 
 <file path=customXml/item1.xml><?xml version="1.0" encoding="utf-8"?>
-<p:properties xmlns:p="http://schemas.microsoft.com/office/2006/metadata/properties" xmlns:xsi="http://www.w3.org/2001/XMLSchema-instance" xmlns:pc="http://schemas.microsoft.com/office/infopath/2007/PartnerControls">
-  <documentManagement>
-    <Background xmlns="71af3243-3dd4-4a8d-8c0d-dd76da1f02a5">false</Background>
-    <Status xmlns="71af3243-3dd4-4a8d-8c0d-dd76da1f02a5">Not started</Status>
-    <_ip_UnifiedCompliancePolicyUIAction xmlns="http://schemas.microsoft.com/sharepoint/v3" xsi:nil="true"/>
-    <Image xmlns="71af3243-3dd4-4a8d-8c0d-dd76da1f02a5">
-      <Url xsi:nil="true"/>
-      <Description xsi:nil="true"/>
-    </Image>
-    <_ip_UnifiedCompliancePolicyProperties xmlns="http://schemas.microsoft.com/sharepoint/v3" xsi:nil="true"/>
-    <ImageTagsTaxHTField xmlns="71af3243-3dd4-4a8d-8c0d-dd76da1f02a5">
-      <Terms xmlns="http://schemas.microsoft.com/office/infopath/2007/PartnerControls"/>
-    </ImageTagsTaxHTField>
-    <TaxCatchAll xmlns="230e9df3-be65-4c73-a93b-d1236ebd677e" xsi:nil="true"/>
-    <MediaServiceKeyPoints xmlns="71af3243-3dd4-4a8d-8c0d-dd76da1f02a5" xsi:nil="true"/>
-  </documentManagement>
-</p:properties>
+<b:Sources xmlns:b="http://schemas.openxmlformats.org/officeDocument/2006/bibliography" xmlns="http://schemas.openxmlformats.org/officeDocument/2006/bibliography" SelectedStyle="\APASixthEditionOfficeOnline.xsl" StyleName="APA" Version="6"/>
 </file>
 
 <file path=customXml/item2.xml><?xml version="1.0" encoding="utf-8"?>
-<?mso-contentType ?>
-<FormTemplates xmlns="http://schemas.microsoft.com/sharepoint/v3/contenttype/forms">
-  <Display>DocumentLibraryForm</Display>
-  <Edit>DocumentLibraryForm</Edit>
-  <New>DocumentLibraryForm</New>
-</FormTemplates>
-</file>
-
-<file path=customXml/item3.xml><?xml version="1.0" encoding="utf-8"?>
 <ct:contentTypeSchema xmlns:ct="http://schemas.microsoft.com/office/2006/metadata/contentType" xmlns:ma="http://schemas.microsoft.com/office/2006/metadata/properties/metaAttributes" ct:_="" ma:_="" ma:contentTypeName="Document" ma:contentTypeID="0x01010079F111ED35F8CC479449609E8A0923A6" ma:contentTypeVersion="26" ma:contentTypeDescription="Create a new document." ma:contentTypeScope="" ma:versionID="ac37c1753acd5e330d2062ccec26ea66">
   <xsd:schema xmlns:xsd="http://www.w3.org/2001/XMLSchema" xmlns:xs="http://www.w3.org/2001/XMLSchema" xmlns:p="http://schemas.microsoft.com/office/2006/metadata/properties" xmlns:ns1="http://schemas.microsoft.com/sharepoint/v3" xmlns:ns2="71af3243-3dd4-4a8d-8c0d-dd76da1f02a5" xmlns:ns3="16c05727-aa75-4e4a-9b5f-8a80a1165891" xmlns:ns4="230e9df3-be65-4c73-a93b-d1236ebd677e" targetNamespace="http://schemas.microsoft.com/office/2006/metadata/properties" ma:root="true" ma:fieldsID="3b340c7101c92c5120abd06486f94548" ns1:_="" ns2:_="" ns3:_="" ns4:_="">
     <xsd:import namespace="http://schemas.microsoft.com/sharepoint/v3"/>
@@ -4999,30 +5308,55 @@
 </ct:contentTypeSchema>
 </file>
 
+<file path=customXml/item3.xml><?xml version="1.0" encoding="utf-8"?>
+<?mso-contentType ?>
+<FormTemplates xmlns="http://schemas.microsoft.com/sharepoint/v3/contenttype/forms">
+  <Display>DocumentLibraryForm</Display>
+  <Edit>DocumentLibraryForm</Edit>
+  <New>DocumentLibraryForm</New>
+</FormTemplates>
+</file>
+
 <file path=customXml/item4.xml><?xml version="1.0" encoding="utf-8"?>
-<b:Sources xmlns:b="http://schemas.openxmlformats.org/officeDocument/2006/bibliography" xmlns="http://schemas.openxmlformats.org/officeDocument/2006/bibliography" SelectedStyle="\APASixthEditionOfficeOnline.xsl" StyleName="APA" Version="6"/>
+<p:properties xmlns:p="http://schemas.microsoft.com/office/2006/metadata/properties" xmlns:xsi="http://www.w3.org/2001/XMLSchema-instance" xmlns:pc="http://schemas.microsoft.com/office/infopath/2007/PartnerControls">
+  <documentManagement>
+    <Background xmlns="71af3243-3dd4-4a8d-8c0d-dd76da1f02a5">false</Background>
+    <Status xmlns="71af3243-3dd4-4a8d-8c0d-dd76da1f02a5">Not started</Status>
+    <_ip_UnifiedCompliancePolicyUIAction xmlns="http://schemas.microsoft.com/sharepoint/v3" xsi:nil="true"/>
+    <Image xmlns="71af3243-3dd4-4a8d-8c0d-dd76da1f02a5">
+      <Url xsi:nil="true"/>
+      <Description xsi:nil="true"/>
+    </Image>
+    <_ip_UnifiedCompliancePolicyProperties xmlns="http://schemas.microsoft.com/sharepoint/v3" xsi:nil="true"/>
+    <ImageTagsTaxHTField xmlns="71af3243-3dd4-4a8d-8c0d-dd76da1f02a5">
+      <Terms xmlns="http://schemas.microsoft.com/office/infopath/2007/PartnerControls"/>
+    </ImageTagsTaxHTField>
+    <TaxCatchAll xmlns="230e9df3-be65-4c73-a93b-d1236ebd677e" xsi:nil="true"/>
+    <MediaServiceKeyPoints xmlns="71af3243-3dd4-4a8d-8c0d-dd76da1f02a5" xsi:nil="true"/>
+  </documentManagement>
+</p:properties>
 </file>
 
 <file path=customXml/itemProps1.xml><?xml version="1.0" encoding="utf-8"?>
-<ds:datastoreItem xmlns:ds="http://schemas.openxmlformats.org/officeDocument/2006/customXml" ds:itemID="{C16B7056-2466-4AA1-A4C4-E365F353E8AA}">
+<ds:datastoreItem xmlns:ds="http://schemas.openxmlformats.org/officeDocument/2006/customXml" ds:itemID="{4340EFE2-4790-4963-A265-5A55FE09B729}">
   <ds:schemaRefs/>
 </ds:datastoreItem>
 </file>
 
 <file path=customXml/itemProps2.xml><?xml version="1.0" encoding="utf-8"?>
+<ds:datastoreItem xmlns:ds="http://schemas.openxmlformats.org/officeDocument/2006/customXml" ds:itemID="{E9E1B831-473E-4216-A45E-58D46BDACEE1}">
+  <ds:schemaRefs/>
+</ds:datastoreItem>
+</file>
+
+<file path=customXml/itemProps3.xml><?xml version="1.0" encoding="utf-8"?>
 <ds:datastoreItem xmlns:ds="http://schemas.openxmlformats.org/officeDocument/2006/customXml" ds:itemID="{E41E8C2D-74E7-4FA6-A628-E1D211022C5C}">
   <ds:schemaRefs/>
 </ds:datastoreItem>
 </file>
 
-<file path=customXml/itemProps3.xml><?xml version="1.0" encoding="utf-8"?>
-<ds:datastoreItem xmlns:ds="http://schemas.openxmlformats.org/officeDocument/2006/customXml" ds:itemID="{E9E1B831-473E-4216-A45E-58D46BDACEE1}">
-  <ds:schemaRefs/>
-</ds:datastoreItem>
-</file>
-
 <file path=customXml/itemProps4.xml><?xml version="1.0" encoding="utf-8"?>
-<ds:datastoreItem xmlns:ds="http://schemas.openxmlformats.org/officeDocument/2006/customXml" ds:itemID="{4340EFE2-4790-4963-A265-5A55FE09B729}">
+<ds:datastoreItem xmlns:ds="http://schemas.openxmlformats.org/officeDocument/2006/customXml" ds:itemID="{C16B7056-2466-4AA1-A4C4-E365F353E8AA}">
   <ds:schemaRefs/>
 </ds:datastoreItem>
 </file>
</xml_diff>

<commit_message>
feat: update template data structure to include portfolio and modify template display
</commit_message>
<xml_diff>
--- a/public/template.docx
+++ b/public/template.docx
@@ -37,12 +37,6 @@
             <w:insideH w:val="none" w:color="auto" w:sz="0" w:space="0"/>
             <w:insideV w:val="none" w:color="auto" w:sz="0" w:space="0"/>
           </w:tblBorders>
-          <w:tblCellMar>
-            <w:top w:w="0" w:type="dxa"/>
-            <w:left w:w="0" w:type="dxa"/>
-            <w:bottom w:w="0" w:type="dxa"/>
-            <w:right w:w="0" w:type="dxa"/>
-          </w:tblCellMar>
         </w:tblPrEx>
         <w:trPr>
           <w:trHeight w:val="1098" w:hRule="atLeast"/>
@@ -195,7 +189,19 @@
                 <w:szCs w:val="28"/>
                 <w:lang w:val="en-US"/>
               </w:rPr>
-              <w:t>{github} | {linkedin}</w:t>
+              <w:t>{portfolio</w:t>
+            </w:r>
+            <w:bookmarkStart w:id="0" w:name="_GoBack"/>
+            <w:bookmarkEnd w:id="0"/>
+            <w:r>
+              <w:rPr>
+                <w:rFonts w:hint="default" w:ascii="Roboto" w:hAnsi="Roboto" w:cs="Roboto"/>
+                <w:color w:val="auto"/>
+                <w:sz w:val="22"/>
+                <w:szCs w:val="28"/>
+                <w:lang w:val="en-US"/>
+              </w:rPr>
+              <w:t>} | {linkedin}</w:t>
             </w:r>
           </w:p>
         </w:tc>
@@ -1146,7 +1152,6 @@
           <w:rFonts w:hint="default"/>
         </w:rPr>
       </w:pPr>
-      <w:bookmarkStart w:id="0" w:name="_GoBack"/>
       <w:r>
         <w:rPr>
           <w:rFonts w:hint="default" w:ascii="Roboto" w:hAnsi="Roboto" w:cs="Roboto"/>
@@ -1159,7 +1164,6 @@
         </w:rPr>
         <w:t>Bachelor of Information Systems - Darwan Ali University</w:t>
       </w:r>
-      <w:bookmarkEnd w:id="0"/>
     </w:p>
     <w:p>
       <w:pPr>
@@ -1653,10 +1657,10 @@
     <w:lsdException w:unhideWhenUsed="0" w:uiPriority="61" w:semiHidden="0" w:name="Light List"/>
     <w:lsdException w:unhideWhenUsed="0" w:uiPriority="62" w:semiHidden="0" w:name="Light Grid"/>
     <w:lsdException w:unhideWhenUsed="0" w:uiPriority="63" w:semiHidden="0" w:name="Medium Shading 1"/>
-    <w:lsdException w:unhideWhenUsed="0" w:uiPriority="64" w:semiHidden="0" w:name="Medium Shading 2"/>
-    <w:lsdException w:unhideWhenUsed="0" w:uiPriority="65" w:semiHidden="0" w:name="Medium List 1"/>
-    <w:lsdException w:unhideWhenUsed="0" w:uiPriority="66" w:semiHidden="0" w:name="Medium List 2"/>
-    <w:lsdException w:unhideWhenUsed="0" w:uiPriority="67" w:semiHidden="0" w:name="Medium Grid 1"/>
+    <w:lsdException w:qFormat="1" w:unhideWhenUsed="0" w:uiPriority="64" w:semiHidden="0" w:name="Medium Shading 2"/>
+    <w:lsdException w:qFormat="1" w:unhideWhenUsed="0" w:uiPriority="65" w:semiHidden="0" w:name="Medium List 1"/>
+    <w:lsdException w:qFormat="1" w:unhideWhenUsed="0" w:uiPriority="66" w:semiHidden="0" w:name="Medium List 2"/>
+    <w:lsdException w:qFormat="1" w:unhideWhenUsed="0" w:uiPriority="67" w:semiHidden="0" w:name="Medium Grid 1"/>
     <w:lsdException w:unhideWhenUsed="0" w:uiPriority="68" w:semiHidden="0" w:name="Medium Grid 2"/>
     <w:lsdException w:unhideWhenUsed="0" w:uiPriority="69" w:semiHidden="0" w:name="Medium Grid 3"/>
     <w:lsdException w:unhideWhenUsed="0" w:uiPriority="70" w:semiHidden="0" w:name="Dark List"/>
@@ -1669,10 +1673,10 @@
     <w:lsdException w:unhideWhenUsed="0" w:uiPriority="63" w:semiHidden="0" w:name="Medium Shading 1 Accent 1"/>
     <w:lsdException w:unhideWhenUsed="0" w:uiPriority="64" w:semiHidden="0" w:name="Medium Shading 2 Accent 1"/>
     <w:lsdException w:unhideWhenUsed="0" w:uiPriority="65" w:semiHidden="0" w:name="Medium List 1 Accent 1"/>
-    <w:lsdException w:unhideWhenUsed="0" w:uiPriority="66" w:semiHidden="0" w:name="Medium List 2 Accent 1"/>
-    <w:lsdException w:unhideWhenUsed="0" w:uiPriority="67" w:semiHidden="0" w:name="Medium Grid 1 Accent 1"/>
+    <w:lsdException w:qFormat="1" w:unhideWhenUsed="0" w:uiPriority="66" w:semiHidden="0" w:name="Medium List 2 Accent 1"/>
+    <w:lsdException w:qFormat="1" w:unhideWhenUsed="0" w:uiPriority="67" w:semiHidden="0" w:name="Medium Grid 1 Accent 1"/>
     <w:lsdException w:unhideWhenUsed="0" w:uiPriority="68" w:semiHidden="0" w:name="Medium Grid 2 Accent 1"/>
-    <w:lsdException w:unhideWhenUsed="0" w:uiPriority="69" w:semiHidden="0" w:name="Medium Grid 3 Accent 1"/>
+    <w:lsdException w:qFormat="1" w:unhideWhenUsed="0" w:uiPriority="69" w:semiHidden="0" w:name="Medium Grid 3 Accent 1"/>
     <w:lsdException w:unhideWhenUsed="0" w:uiPriority="70" w:semiHidden="0" w:name="Dark List Accent 1"/>
     <w:lsdException w:unhideWhenUsed="0" w:uiPriority="71" w:semiHidden="0" w:name="Colorful Shading Accent 1"/>
     <w:lsdException w:unhideWhenUsed="0" w:uiPriority="72" w:semiHidden="0" w:name="Colorful List Accent 1"/>
@@ -1681,12 +1685,12 @@
     <w:lsdException w:unhideWhenUsed="0" w:uiPriority="61" w:semiHidden="0" w:name="Light List Accent 2"/>
     <w:lsdException w:unhideWhenUsed="0" w:uiPriority="62" w:semiHidden="0" w:name="Light Grid Accent 2"/>
     <w:lsdException w:unhideWhenUsed="0" w:uiPriority="63" w:semiHidden="0" w:name="Medium Shading 1 Accent 2"/>
-    <w:lsdException w:unhideWhenUsed="0" w:uiPriority="64" w:semiHidden="0" w:name="Medium Shading 2 Accent 2"/>
+    <w:lsdException w:qFormat="1" w:unhideWhenUsed="0" w:uiPriority="64" w:semiHidden="0" w:name="Medium Shading 2 Accent 2"/>
     <w:lsdException w:unhideWhenUsed="0" w:uiPriority="65" w:semiHidden="0" w:name="Medium List 1 Accent 2"/>
-    <w:lsdException w:unhideWhenUsed="0" w:uiPriority="66" w:semiHidden="0" w:name="Medium List 2 Accent 2"/>
-    <w:lsdException w:unhideWhenUsed="0" w:uiPriority="67" w:semiHidden="0" w:name="Medium Grid 1 Accent 2"/>
-    <w:lsdException w:unhideWhenUsed="0" w:uiPriority="68" w:semiHidden="0" w:name="Medium Grid 2 Accent 2"/>
-    <w:lsdException w:unhideWhenUsed="0" w:uiPriority="69" w:semiHidden="0" w:name="Medium Grid 3 Accent 2"/>
+    <w:lsdException w:qFormat="1" w:unhideWhenUsed="0" w:uiPriority="66" w:semiHidden="0" w:name="Medium List 2 Accent 2"/>
+    <w:lsdException w:qFormat="1" w:unhideWhenUsed="0" w:uiPriority="67" w:semiHidden="0" w:name="Medium Grid 1 Accent 2"/>
+    <w:lsdException w:qFormat="1" w:unhideWhenUsed="0" w:uiPriority="68" w:semiHidden="0" w:name="Medium Grid 2 Accent 2"/>
+    <w:lsdException w:qFormat="1" w:unhideWhenUsed="0" w:uiPriority="69" w:semiHidden="0" w:name="Medium Grid 3 Accent 2"/>
     <w:lsdException w:unhideWhenUsed="0" w:uiPriority="70" w:semiHidden="0" w:name="Dark List Accent 2"/>
     <w:lsdException w:unhideWhenUsed="0" w:uiPriority="71" w:semiHidden="0" w:name="Colorful Shading Accent 2"/>
     <w:lsdException w:unhideWhenUsed="0" w:uiPriority="72" w:semiHidden="0" w:name="Colorful List Accent 2"/>
@@ -1695,10 +1699,10 @@
     <w:lsdException w:unhideWhenUsed="0" w:uiPriority="61" w:semiHidden="0" w:name="Light List Accent 3"/>
     <w:lsdException w:unhideWhenUsed="0" w:uiPriority="62" w:semiHidden="0" w:name="Light Grid Accent 3"/>
     <w:lsdException w:unhideWhenUsed="0" w:uiPriority="63" w:semiHidden="0" w:name="Medium Shading 1 Accent 3"/>
-    <w:lsdException w:unhideWhenUsed="0" w:uiPriority="64" w:semiHidden="0" w:name="Medium Shading 2 Accent 3"/>
+    <w:lsdException w:qFormat="1" w:unhideWhenUsed="0" w:uiPriority="64" w:semiHidden="0" w:name="Medium Shading 2 Accent 3"/>
     <w:lsdException w:unhideWhenUsed="0" w:uiPriority="65" w:semiHidden="0" w:name="Medium List 1 Accent 3"/>
-    <w:lsdException w:unhideWhenUsed="0" w:uiPriority="66" w:semiHidden="0" w:name="Medium List 2 Accent 3"/>
-    <w:lsdException w:unhideWhenUsed="0" w:uiPriority="67" w:semiHidden="0" w:name="Medium Grid 1 Accent 3"/>
+    <w:lsdException w:qFormat="1" w:unhideWhenUsed="0" w:uiPriority="66" w:semiHidden="0" w:name="Medium List 2 Accent 3"/>
+    <w:lsdException w:qFormat="1" w:unhideWhenUsed="0" w:uiPriority="67" w:semiHidden="0" w:name="Medium Grid 1 Accent 3"/>
     <w:lsdException w:unhideWhenUsed="0" w:uiPriority="68" w:semiHidden="0" w:name="Medium Grid 2 Accent 3"/>
     <w:lsdException w:unhideWhenUsed="0" w:uiPriority="69" w:semiHidden="0" w:name="Medium Grid 3 Accent 3"/>
     <w:lsdException w:unhideWhenUsed="0" w:uiPriority="70" w:semiHidden="0" w:name="Dark List Accent 3"/>
@@ -1708,11 +1712,11 @@
     <w:lsdException w:unhideWhenUsed="0" w:uiPriority="60" w:semiHidden="0" w:name="Light Shading Accent 4"/>
     <w:lsdException w:unhideWhenUsed="0" w:uiPriority="61" w:semiHidden="0" w:name="Light List Accent 4"/>
     <w:lsdException w:unhideWhenUsed="0" w:uiPriority="62" w:semiHidden="0" w:name="Light Grid Accent 4"/>
-    <w:lsdException w:unhideWhenUsed="0" w:uiPriority="63" w:semiHidden="0" w:name="Medium Shading 1 Accent 4"/>
-    <w:lsdException w:unhideWhenUsed="0" w:uiPriority="64" w:semiHidden="0" w:name="Medium Shading 2 Accent 4"/>
-    <w:lsdException w:unhideWhenUsed="0" w:uiPriority="65" w:semiHidden="0" w:name="Medium List 1 Accent 4"/>
+    <w:lsdException w:qFormat="1" w:unhideWhenUsed="0" w:uiPriority="63" w:semiHidden="0" w:name="Medium Shading 1 Accent 4"/>
+    <w:lsdException w:qFormat="1" w:unhideWhenUsed="0" w:uiPriority="64" w:semiHidden="0" w:name="Medium Shading 2 Accent 4"/>
+    <w:lsdException w:qFormat="1" w:unhideWhenUsed="0" w:uiPriority="65" w:semiHidden="0" w:name="Medium List 1 Accent 4"/>
     <w:lsdException w:unhideWhenUsed="0" w:uiPriority="66" w:semiHidden="0" w:name="Medium List 2 Accent 4"/>
-    <w:lsdException w:unhideWhenUsed="0" w:uiPriority="67" w:semiHidden="0" w:name="Medium Grid 1 Accent 4"/>
+    <w:lsdException w:qFormat="1" w:unhideWhenUsed="0" w:uiPriority="67" w:semiHidden="0" w:name="Medium Grid 1 Accent 4"/>
     <w:lsdException w:unhideWhenUsed="0" w:uiPriority="68" w:semiHidden="0" w:name="Medium Grid 2 Accent 4"/>
     <w:lsdException w:unhideWhenUsed="0" w:uiPriority="69" w:semiHidden="0" w:name="Medium Grid 3 Accent 4"/>
     <w:lsdException w:unhideWhenUsed="0" w:uiPriority="70" w:semiHidden="0" w:name="Dark List Accent 4"/>
@@ -1722,12 +1726,12 @@
     <w:lsdException w:unhideWhenUsed="0" w:uiPriority="60" w:semiHidden="0" w:name="Light Shading Accent 5"/>
     <w:lsdException w:unhideWhenUsed="0" w:uiPriority="61" w:semiHidden="0" w:name="Light List Accent 5"/>
     <w:lsdException w:unhideWhenUsed="0" w:uiPriority="62" w:semiHidden="0" w:name="Light Grid Accent 5"/>
-    <w:lsdException w:unhideWhenUsed="0" w:uiPriority="63" w:semiHidden="0" w:name="Medium Shading 1 Accent 5"/>
-    <w:lsdException w:unhideWhenUsed="0" w:uiPriority="64" w:semiHidden="0" w:name="Medium Shading 2 Accent 5"/>
-    <w:lsdException w:unhideWhenUsed="0" w:uiPriority="65" w:semiHidden="0" w:name="Medium List 1 Accent 5"/>
+    <w:lsdException w:qFormat="1" w:unhideWhenUsed="0" w:uiPriority="63" w:semiHidden="0" w:name="Medium Shading 1 Accent 5"/>
+    <w:lsdException w:qFormat="1" w:unhideWhenUsed="0" w:uiPriority="64" w:semiHidden="0" w:name="Medium Shading 2 Accent 5"/>
+    <w:lsdException w:qFormat="1" w:unhideWhenUsed="0" w:uiPriority="65" w:semiHidden="0" w:name="Medium List 1 Accent 5"/>
     <w:lsdException w:unhideWhenUsed="0" w:uiPriority="66" w:semiHidden="0" w:name="Medium List 2 Accent 5"/>
-    <w:lsdException w:unhideWhenUsed="0" w:uiPriority="67" w:semiHidden="0" w:name="Medium Grid 1 Accent 5"/>
-    <w:lsdException w:unhideWhenUsed="0" w:uiPriority="68" w:semiHidden="0" w:name="Medium Grid 2 Accent 5"/>
+    <w:lsdException w:qFormat="1" w:unhideWhenUsed="0" w:uiPriority="67" w:semiHidden="0" w:name="Medium Grid 1 Accent 5"/>
+    <w:lsdException w:qFormat="1" w:unhideWhenUsed="0" w:uiPriority="68" w:semiHidden="0" w:name="Medium Grid 2 Accent 5"/>
     <w:lsdException w:unhideWhenUsed="0" w:uiPriority="69" w:semiHidden="0" w:name="Medium Grid 3 Accent 5"/>
     <w:lsdException w:unhideWhenUsed="0" w:uiPriority="70" w:semiHidden="0" w:name="Dark List Accent 5"/>
     <w:lsdException w:unhideWhenUsed="0" w:uiPriority="71" w:semiHidden="0" w:name="Colorful Shading Accent 5"/>
@@ -1736,12 +1740,12 @@
     <w:lsdException w:unhideWhenUsed="0" w:uiPriority="60" w:semiHidden="0" w:name="Light Shading Accent 6"/>
     <w:lsdException w:unhideWhenUsed="0" w:uiPriority="61" w:semiHidden="0" w:name="Light List Accent 6"/>
     <w:lsdException w:unhideWhenUsed="0" w:uiPriority="62" w:semiHidden="0" w:name="Light Grid Accent 6"/>
-    <w:lsdException w:unhideWhenUsed="0" w:uiPriority="63" w:semiHidden="0" w:name="Medium Shading 1 Accent 6"/>
+    <w:lsdException w:qFormat="1" w:unhideWhenUsed="0" w:uiPriority="63" w:semiHidden="0" w:name="Medium Shading 1 Accent 6"/>
     <w:lsdException w:unhideWhenUsed="0" w:uiPriority="64" w:semiHidden="0" w:name="Medium Shading 2 Accent 6"/>
     <w:lsdException w:unhideWhenUsed="0" w:uiPriority="65" w:semiHidden="0" w:name="Medium List 1 Accent 6"/>
     <w:lsdException w:unhideWhenUsed="0" w:uiPriority="66" w:semiHidden="0" w:name="Medium List 2 Accent 6"/>
     <w:lsdException w:unhideWhenUsed="0" w:uiPriority="67" w:semiHidden="0" w:name="Medium Grid 1 Accent 6"/>
-    <w:lsdException w:unhideWhenUsed="0" w:uiPriority="68" w:semiHidden="0" w:name="Medium Grid 2 Accent 6"/>
+    <w:lsdException w:qFormat="1" w:unhideWhenUsed="0" w:uiPriority="68" w:semiHidden="0" w:name="Medium Grid 2 Accent 6"/>
     <w:lsdException w:unhideWhenUsed="0" w:uiPriority="69" w:semiHidden="0" w:name="Medium Grid 3 Accent 6"/>
     <w:lsdException w:unhideWhenUsed="0" w:uiPriority="70" w:semiHidden="0" w:name="Dark List Accent 6"/>
     <w:lsdException w:unhideWhenUsed="0" w:uiPriority="71" w:semiHidden="0" w:name="Colorful Shading Accent 6"/>
@@ -5005,10 +5009,35 @@
 </file>
 
 <file path=customXml/item1.xml><?xml version="1.0" encoding="utf-8"?>
-<b:Sources xmlns:b="http://schemas.openxmlformats.org/officeDocument/2006/bibliography" xmlns="http://schemas.openxmlformats.org/officeDocument/2006/bibliography" SelectedStyle="\APASixthEditionOfficeOnline.xsl" StyleName="APA" Version="6"/>
+<p:properties xmlns:p="http://schemas.microsoft.com/office/2006/metadata/properties" xmlns:xsi="http://www.w3.org/2001/XMLSchema-instance" xmlns:pc="http://schemas.microsoft.com/office/infopath/2007/PartnerControls">
+  <documentManagement>
+    <Background xmlns="71af3243-3dd4-4a8d-8c0d-dd76da1f02a5">false</Background>
+    <Status xmlns="71af3243-3dd4-4a8d-8c0d-dd76da1f02a5">Not started</Status>
+    <_ip_UnifiedCompliancePolicyUIAction xmlns="http://schemas.microsoft.com/sharepoint/v3" xsi:nil="true"/>
+    <Image xmlns="71af3243-3dd4-4a8d-8c0d-dd76da1f02a5">
+      <Url xsi:nil="true"/>
+      <Description xsi:nil="true"/>
+    </Image>
+    <_ip_UnifiedCompliancePolicyProperties xmlns="http://schemas.microsoft.com/sharepoint/v3" xsi:nil="true"/>
+    <ImageTagsTaxHTField xmlns="71af3243-3dd4-4a8d-8c0d-dd76da1f02a5">
+      <Terms xmlns="http://schemas.microsoft.com/office/infopath/2007/PartnerControls"/>
+    </ImageTagsTaxHTField>
+    <TaxCatchAll xmlns="230e9df3-be65-4c73-a93b-d1236ebd677e" xsi:nil="true"/>
+    <MediaServiceKeyPoints xmlns="71af3243-3dd4-4a8d-8c0d-dd76da1f02a5" xsi:nil="true"/>
+  </documentManagement>
+</p:properties>
 </file>
 
 <file path=customXml/item2.xml><?xml version="1.0" encoding="utf-8"?>
+<?mso-contentType ?>
+<FormTemplates xmlns="http://schemas.microsoft.com/sharepoint/v3/contenttype/forms">
+  <Display>DocumentLibraryForm</Display>
+  <Edit>DocumentLibraryForm</Edit>
+  <New>DocumentLibraryForm</New>
+</FormTemplates>
+</file>
+
+<file path=customXml/item3.xml><?xml version="1.0" encoding="utf-8"?>
 <ct:contentTypeSchema xmlns:ct="http://schemas.microsoft.com/office/2006/metadata/contentType" xmlns:ma="http://schemas.microsoft.com/office/2006/metadata/properties/metaAttributes" ct:_="" ma:_="" ma:contentTypeName="Document" ma:contentTypeID="0x01010079F111ED35F8CC479449609E8A0923A6" ma:contentTypeVersion="26" ma:contentTypeDescription="Create a new document." ma:contentTypeScope="" ma:versionID="ac37c1753acd5e330d2062ccec26ea66">
   <xsd:schema xmlns:xsd="http://www.w3.org/2001/XMLSchema" xmlns:xs="http://www.w3.org/2001/XMLSchema" xmlns:p="http://schemas.microsoft.com/office/2006/metadata/properties" xmlns:ns1="http://schemas.microsoft.com/sharepoint/v3" xmlns:ns2="71af3243-3dd4-4a8d-8c0d-dd76da1f02a5" xmlns:ns3="16c05727-aa75-4e4a-9b5f-8a80a1165891" xmlns:ns4="230e9df3-be65-4c73-a93b-d1236ebd677e" targetNamespace="http://schemas.microsoft.com/office/2006/metadata/properties" ma:root="true" ma:fieldsID="3b340c7101c92c5120abd06486f94548" ns1:_="" ns2:_="" ns3:_="" ns4:_="">
     <xsd:import namespace="http://schemas.microsoft.com/sharepoint/v3"/>
@@ -5308,55 +5337,30 @@
 </ct:contentTypeSchema>
 </file>
 
-<file path=customXml/item3.xml><?xml version="1.0" encoding="utf-8"?>
-<?mso-contentType ?>
-<FormTemplates xmlns="http://schemas.microsoft.com/sharepoint/v3/contenttype/forms">
-  <Display>DocumentLibraryForm</Display>
-  <Edit>DocumentLibraryForm</Edit>
-  <New>DocumentLibraryForm</New>
-</FormTemplates>
-</file>
-
 <file path=customXml/item4.xml><?xml version="1.0" encoding="utf-8"?>
-<p:properties xmlns:p="http://schemas.microsoft.com/office/2006/metadata/properties" xmlns:xsi="http://www.w3.org/2001/XMLSchema-instance" xmlns:pc="http://schemas.microsoft.com/office/infopath/2007/PartnerControls">
-  <documentManagement>
-    <Background xmlns="71af3243-3dd4-4a8d-8c0d-dd76da1f02a5">false</Background>
-    <Status xmlns="71af3243-3dd4-4a8d-8c0d-dd76da1f02a5">Not started</Status>
-    <_ip_UnifiedCompliancePolicyUIAction xmlns="http://schemas.microsoft.com/sharepoint/v3" xsi:nil="true"/>
-    <Image xmlns="71af3243-3dd4-4a8d-8c0d-dd76da1f02a5">
-      <Url xsi:nil="true"/>
-      <Description xsi:nil="true"/>
-    </Image>
-    <_ip_UnifiedCompliancePolicyProperties xmlns="http://schemas.microsoft.com/sharepoint/v3" xsi:nil="true"/>
-    <ImageTagsTaxHTField xmlns="71af3243-3dd4-4a8d-8c0d-dd76da1f02a5">
-      <Terms xmlns="http://schemas.microsoft.com/office/infopath/2007/PartnerControls"/>
-    </ImageTagsTaxHTField>
-    <TaxCatchAll xmlns="230e9df3-be65-4c73-a93b-d1236ebd677e" xsi:nil="true"/>
-    <MediaServiceKeyPoints xmlns="71af3243-3dd4-4a8d-8c0d-dd76da1f02a5" xsi:nil="true"/>
-  </documentManagement>
-</p:properties>
+<b:Sources xmlns:b="http://schemas.openxmlformats.org/officeDocument/2006/bibliography" xmlns="http://schemas.openxmlformats.org/officeDocument/2006/bibliography" SelectedStyle="\APASixthEditionOfficeOnline.xsl" StyleName="APA" Version="6"/>
 </file>
 
 <file path=customXml/itemProps1.xml><?xml version="1.0" encoding="utf-8"?>
-<ds:datastoreItem xmlns:ds="http://schemas.openxmlformats.org/officeDocument/2006/customXml" ds:itemID="{4340EFE2-4790-4963-A265-5A55FE09B729}">
+<ds:datastoreItem xmlns:ds="http://schemas.openxmlformats.org/officeDocument/2006/customXml" ds:itemID="{C16B7056-2466-4AA1-A4C4-E365F353E8AA}">
   <ds:schemaRefs/>
 </ds:datastoreItem>
 </file>
 
 <file path=customXml/itemProps2.xml><?xml version="1.0" encoding="utf-8"?>
+<ds:datastoreItem xmlns:ds="http://schemas.openxmlformats.org/officeDocument/2006/customXml" ds:itemID="{E41E8C2D-74E7-4FA6-A628-E1D211022C5C}">
+  <ds:schemaRefs/>
+</ds:datastoreItem>
+</file>
+
+<file path=customXml/itemProps3.xml><?xml version="1.0" encoding="utf-8"?>
 <ds:datastoreItem xmlns:ds="http://schemas.openxmlformats.org/officeDocument/2006/customXml" ds:itemID="{E9E1B831-473E-4216-A45E-58D46BDACEE1}">
   <ds:schemaRefs/>
 </ds:datastoreItem>
 </file>
 
-<file path=customXml/itemProps3.xml><?xml version="1.0" encoding="utf-8"?>
-<ds:datastoreItem xmlns:ds="http://schemas.openxmlformats.org/officeDocument/2006/customXml" ds:itemID="{E41E8C2D-74E7-4FA6-A628-E1D211022C5C}">
-  <ds:schemaRefs/>
-</ds:datastoreItem>
-</file>
-
 <file path=customXml/itemProps4.xml><?xml version="1.0" encoding="utf-8"?>
-<ds:datastoreItem xmlns:ds="http://schemas.openxmlformats.org/officeDocument/2006/customXml" ds:itemID="{C16B7056-2466-4AA1-A4C4-E365F353E8AA}">
+<ds:datastoreItem xmlns:ds="http://schemas.openxmlformats.org/officeDocument/2006/customXml" ds:itemID="{4340EFE2-4790-4963-A265-5A55FE09B729}">
   <ds:schemaRefs/>
 </ds:datastoreItem>
 </file>
</xml_diff>